<commit_message>
Require spec-specific CoC with printed one-year validity
The conformity certificate must be re-issued against our ordered specs
(6061-T6, 450x30x3000 / 460x8x3000) with issue and expiry dates printed,
on a one-year renewal basis — the copy received covers generic aluminum
profiles, is sample-limited, and carries no expiry date at all.

Co-Authored-By: Claude Fable 5 <noreply@anthropic.com>
Claude-Session: https://claude.ai/code/session_01D8V4YsNDSgybhuKSqPBmt4
</commit_message>
<xml_diff>
--- a/docs/shandong-botong/Botong_Meeting_Checklist.docx
+++ b/docs/shandong-botong/Botong_Meeting_Checklist.docx
@@ -553,7 +553,7 @@
                 <w:sz w:val="19"/>
                 <w:szCs w:val="19"/>
               </w:rPr>
-              <w:t xml:space="preserve">RoHS 증서 재발행 + 시험성적서 RKEYS241209039 — 수령분은 CE 아닌 시료 한정 RoHS 증서</w:t>
+              <w:t xml:space="preserve">적합성 증서(CoC, "CE" 서류) 재발행 — 당사 발주 스펙 기준 필수: 재질 6061-T6 + 규격 450×30×3000 / 460×8×3000 명기, 발급일·만료일 필수 인쇄, 유효기간 1년(연간 갱신). 수령분은 일반 aluminum profiles 시료 한정 RoHS 증서 + 만기일 없음. 시험성적서 원본 첨부</w:t>
             </w:r>
           </w:p>
         </w:tc>
@@ -579,7 +579,7 @@
                 <w:sz w:val="19"/>
                 <w:szCs w:val="19"/>
               </w:rPr>
-              <w:t xml:space="preserve">请重新出具 RoHS 证书并提供检测报告正本</w:t>
+              <w:t xml:space="preserve">请按我方订购规格（6061-T6，450×30×3000 / 460×8×3000）重新出具符合性证书，须注明签发日期和有效期（有效期一年，每年更新），并附检测报告正本</w:t>
             </w:r>
           </w:p>
         </w:tc>
@@ -605,7 +605,7 @@
                 <w:sz w:val="19"/>
                 <w:szCs w:val="19"/>
               </w:rPr>
-              <w:t xml:space="preserve">1년 관행 240일 초과</w:t>
+              <w:t xml:space="preserve">스펙 불일치 + 만기일 미기재</w:t>
             </w:r>
           </w:p>
         </w:tc>
@@ -737,6 +737,28 @@
           <w:szCs w:val="20"/>
         </w:rPr>
         <w:t xml:space="preserve">모든 인증서는 발급일·만료일이 보이는 사본으로. 수령 즉시 당사에서 발급기관 조회(진위 확인) 진행.</w:t>
+      </w:r>
+    </w:p>
+    <w:p>
+      <w:pPr>
+        <w:pBdr>
+          <w:top w:val="single" w:color="B03030" w:sz="4"/>
+          <w:bottom w:val="single" w:color="B03030" w:sz="4"/>
+          <w:left w:val="single" w:color="B03030" w:sz="24"/>
+        </w:pBdr>
+        <w:shd w:fill="FDECEA" w:val="clear"/>
+        <w:spacing w:after="140" w:before="80"/>
+        <w:ind w:left="200" w:right="200"/>
+      </w:pPr>
+      <w:r>
+        <w:rPr>
+          <w:b/>
+          <w:bCs/>
+          <w:color w:val="3A2020"/>
+          <w:sz w:val="20"/>
+          <w:szCs w:val="20"/>
+        </w:rPr>
+        <w:t xml:space="preserve">★ 원칙: 재질·사이즈 증빙은 당사 발주 스펙 명기가 기준. 일반 제품군(aluminum profiles 등) 명의 증서는 제이에스텍 제출용 증빙이 되지 않음. 재질(6061-T6) 증빙 = MTC(②), 치수 증빙 = 치수·진원도 검사성적서(②-4). CoC를 별도로 낸다면 그 안에도 당사 규격 명기 필수.</w:t>
       </w:r>
     </w:p>
     <w:p>

</xml_diff>

<commit_message>
Add manufacturer verification question sequence for the site visit
Five-phase English question script to establish whether Botong directly
manufactures the required cold-drawn seamless tubes: open questions
before revealing our analysis, order-specific probes, evidence
confrontation (license/ISO scope, GB/T 6893 vs 4437.1), an outsourcing
fallback path, and a signed written confirmation — anchored on the
condition that the real production site must be shown at the end
customer's on-site audit. Includes an internal decision matrix.

Also drops the quotation-validity item from the meeting checklist:
price negotiation follows manufacturer verification, using the
middleman-margin finding as leverage if production is outsourced.

Co-Authored-By: Claude Fable 5 <noreply@anthropic.com>
Claude-Session: https://claude.ai/code/session_01D8V4YsNDSgybhuKSqPBmt4
</commit_message>
<xml_diff>
--- a/docs/shandong-botong/Botong_Meeting_Checklist.docx
+++ b/docs/shandong-botong/Botong_Meeting_Checklist.docx
@@ -1763,87 +1763,29 @@
           </w:p>
         </w:tc>
       </w:tr>
-      <w:tr>
-        <w:tc>
-          <w:tcPr>
-            <w:tcW w:type="dxa" w:w="300"/>
-            <w:tcMar>
-              <w:top w:type="dxa" w:w="55"/>
-              <w:left w:type="dxa" w:w="100"/>
-              <w:bottom w:type="dxa" w:w="55"/>
-              <w:right w:type="dxa" w:w="100"/>
-            </w:tcMar>
-            <w:vAlign w:val="center"/>
-          </w:tcPr>
-          <w:p>
-            <w:pPr>
-              <w:spacing w:after="0"/>
-            </w:pPr>
-            <w:r>
-              <w:rPr>
-                <w:b w:val="false"/>
-                <w:bCs w:val="false"/>
-                <w:sz w:val="19"/>
-                <w:szCs w:val="19"/>
-              </w:rPr>
-              <w:t xml:space="preserve">5</w:t>
-            </w:r>
-          </w:p>
-        </w:tc>
-        <w:tc>
-          <w:tcPr>
-            <w:tcW w:type="dxa" w:w="5600"/>
-            <w:tcMar>
-              <w:top w:type="dxa" w:w="55"/>
-              <w:left w:type="dxa" w:w="100"/>
-              <w:bottom w:type="dxa" w:w="55"/>
-              <w:right w:type="dxa" w:w="100"/>
-            </w:tcMar>
-            <w:vAlign w:val="center"/>
-          </w:tcPr>
-          <w:p>
-            <w:pPr>
-              <w:spacing w:after="0"/>
-            </w:pPr>
-            <w:r>
-              <w:rPr>
-                <w:b w:val="false"/>
-                <w:bCs w:val="false"/>
-                <w:sz w:val="19"/>
-                <w:szCs w:val="19"/>
-              </w:rPr>
-              <w:t xml:space="preserve">견적 유효기간 5일 → 30일 이상으로 연장 요청</w:t>
-            </w:r>
-          </w:p>
-        </w:tc>
-        <w:tc>
-          <w:tcPr>
-            <w:tcW w:type="dxa" w:w="3406"/>
-            <w:tcMar>
-              <w:top w:type="dxa" w:w="55"/>
-              <w:left w:type="dxa" w:w="100"/>
-              <w:bottom w:type="dxa" w:w="55"/>
-              <w:right w:type="dxa" w:w="100"/>
-            </w:tcMar>
-            <w:vAlign w:val="center"/>
-          </w:tcPr>
-          <w:p>
-            <w:pPr>
-              <w:spacing w:after="0"/>
-            </w:pPr>
-            <w:r>
-              <w:rPr>
-                <w:b w:val="false"/>
-                <w:bCs w:val="false"/>
-                <w:sz w:val="19"/>
-                <w:szCs w:val="19"/>
-              </w:rPr>
-              <w:t xml:space="preserve">매번 실효 방지</w:t>
-            </w:r>
-          </w:p>
-        </w:tc>
-      </w:tr>
     </w:tbl>
+    <w:p>
+      <w:pPr>
+        <w:pBdr>
+          <w:top w:val="single" w:color="B03030" w:sz="4"/>
+          <w:bottom w:val="single" w:color="B03030" w:sz="4"/>
+          <w:left w:val="single" w:color="B03030" w:sz="24"/>
+        </w:pBdr>
+        <w:shd w:fill="FDECEA" w:val="clear"/>
+        <w:spacing w:after="140" w:before="80"/>
+        <w:ind w:left="200" w:right="200"/>
+      </w:pPr>
+      <w:r>
+        <w:rPr>
+          <w:b/>
+          <w:bCs/>
+          <w:color w:val="3A2020"/>
+          <w:sz w:val="20"/>
+          <w:szCs w:val="20"/>
+        </w:rPr>
+        <w:t xml:space="preserve">★ 가격 전략: 이번 미팅에서는 견적을 접수만 하고 확정하지 않는다. 직접 생산자 확인 이후에 가격 네고 진행 — 외주 확인 시 기존 단가의 중간마진을 근거로 인하 요구, 자사 생산 확인 시 물량(Group A·B·C 20개 품목) 기반 네고. 견적 유효기간은 중요하지 않음.</w:t>
+      </w:r>
+    </w:p>
     <w:p>
       <w:pPr>
         <w:pStyle w:val="Heading1"/>

</xml_diff>